<commit_message>
feat: add go-live readiness and local run workflow
Add CI readiness gates, deploy guards, seed/migration validation, and operations scripts.

Add local Windows install/run guide plus one-click runner on high local ports.
</commit_message>
<xml_diff>
--- a/docs/ClawBot-Architecture-VI.docx
+++ b/docs/ClawBot-Architecture-VI.docx
@@ -8260,7 +8260,7 @@
           <w:sz w:val="22"/>
           <w:szCs w:val="22"/>
         </w:rPr>
-        <w:t xml:space="preserve">Mỗi skill có C# adapter interface trong src/agents/Clawbot.Agents.Core/Skills/{Nlp,Lead,Content,Ops}/. Stub hiện throw NotImplementedException; concrete impl theo SPEC.</w:t>
+        <w:t xml:space="preserve">Mỗi skill có C# adapter interface trong src/agents/Clawbot.Agents.Core/Skills/{Nlp,Lead,Content,Ops}/. Các adapter mặc định đã được đăng ký bằng implementation cụ thể; tích hợp ngoài vẫn config-gated/fallback theo SPEC.</w:t>
       </w:r>
     </w:p>
     <w:p>
@@ -10608,7 +10608,7 @@
           <w:sz w:val="22"/>
           <w:szCs w:val="22"/>
         </w:rPr>
-        <w:t xml:space="preserve">Mỗi skill: interface I&lt;Name&gt; + DTO record + internal sealed stub class.</w:t>
+        <w:t xml:space="preserve">Mỗi skill: interface I&lt;Name&gt; + DTO record + internal sealed implementation/fallback class.</w:t>
       </w:r>
     </w:p>
     <w:p>
@@ -10662,7 +10662,7 @@
           <w:sz w:val="22"/>
           <w:szCs w:val="22"/>
         </w:rPr>
-        <w:t xml:space="preserve">Stub hiện throw NotImplementedException; concrete impl theo SPEC riêng cho từng skill.</w:t>
+        <w:t xml:space="preserve">SkillsModule.AddClawbotSkills() đăng ký implementation mặc định cho từng skill; service cần API key hoặc vendor ngoài degrade/fallback theo cấu hình.</w:t>
       </w:r>
     </w:p>
     <w:p>

</xml_diff>